<commit_message>
created additional files or modified existing to match chapter structure
</commit_message>
<xml_diff>
--- a/documents/Chapter_CheckList.docx
+++ b/documents/Chapter_CheckList.docx
@@ -81,6 +81,12 @@
         </w:rPr>
         <w:t xml:space="preserve">    1.1. Background</w:t>
       </w:r>
+      <w:r>
+        <w:rPr>
+          <w:lang w:val="en-GB"/>
+        </w:rPr>
+        <w:t>, X</w:t>
+      </w:r>
     </w:p>
     <w:p>
       <w:pPr>
@@ -94,6 +100,12 @@
         </w:rPr>
         <w:t xml:space="preserve">    1.2. Motivation</w:t>
       </w:r>
+      <w:r>
+        <w:rPr>
+          <w:lang w:val="en-GB"/>
+        </w:rPr>
+        <w:t>, X</w:t>
+      </w:r>
     </w:p>
     <w:p>
       <w:pPr>
@@ -107,6 +119,12 @@
         </w:rPr>
         <w:t xml:space="preserve">    1.3. Problem Statement</w:t>
       </w:r>
+      <w:r>
+        <w:rPr>
+          <w:lang w:val="en-GB"/>
+        </w:rPr>
+        <w:t>, X</w:t>
+      </w:r>
     </w:p>
     <w:p>
       <w:pPr>
@@ -120,6 +138,12 @@
         </w:rPr>
         <w:t xml:space="preserve">    1.4. Scope and Boundaries</w:t>
       </w:r>
+      <w:r>
+        <w:rPr>
+          <w:lang w:val="en-GB"/>
+        </w:rPr>
+        <w:t xml:space="preserve"> , X</w:t>
+      </w:r>
     </w:p>
     <w:p>
       <w:pPr>
@@ -133,6 +157,12 @@
         </w:rPr>
         <w:t xml:space="preserve">    1.5. Expected Outcome</w:t>
       </w:r>
+      <w:r>
+        <w:rPr>
+          <w:lang w:val="en-GB"/>
+        </w:rPr>
+        <w:t xml:space="preserve"> , X</w:t>
+      </w:r>
     </w:p>
     <w:p>
       <w:pPr>
@@ -146,6 +176,12 @@
         </w:rPr>
         <w:t xml:space="preserve">    1.6. Structure of the Document</w:t>
       </w:r>
+      <w:r>
+        <w:rPr>
+          <w:lang w:val="en-GB"/>
+        </w:rPr>
+        <w:t>, X</w:t>
+      </w:r>
     </w:p>
     <w:p>
       <w:pPr>
@@ -179,6 +215,12 @@
         </w:rPr>
         <w:t xml:space="preserve">    2.1. Team Constellation</w:t>
       </w:r>
+      <w:r>
+        <w:rPr>
+          <w:lang w:val="en-GB"/>
+        </w:rPr>
+        <w:t xml:space="preserve"> ,X</w:t>
+      </w:r>
     </w:p>
     <w:p>
       <w:pPr>
@@ -192,6 +234,12 @@
         </w:rPr>
         <w:t xml:space="preserve">    2.2. Project Management Methodologies</w:t>
       </w:r>
+      <w:r>
+        <w:rPr>
+          <w:lang w:val="en-GB"/>
+        </w:rPr>
+        <w:t xml:space="preserve"> , X</w:t>
+      </w:r>
     </w:p>
     <w:p>
       <w:pPr>
@@ -205,6 +253,12 @@
         </w:rPr>
         <w:t xml:space="preserve">        2.2.1. Agile and Iterative Approach [CHANGED]</w:t>
       </w:r>
+      <w:r>
+        <w:rPr>
+          <w:lang w:val="en-GB"/>
+        </w:rPr>
+        <w:t xml:space="preserve"> , X</w:t>
+      </w:r>
     </w:p>
     <w:p>
       <w:pPr>
@@ -218,6 +272,12 @@
         </w:rPr>
         <w:t xml:space="preserve">        2.2.2. Project Plan and Work Packages [NEW]</w:t>
       </w:r>
+      <w:r>
+        <w:rPr>
+          <w:lang w:val="en-GB"/>
+        </w:rPr>
+        <w:t xml:space="preserve"> , X</w:t>
+      </w:r>
     </w:p>
     <w:p>
       <w:pPr>
@@ -231,6 +291,12 @@
         </w:rPr>
         <w:t xml:space="preserve">        2.2.3. Milestones [CHANGED]</w:t>
       </w:r>
+      <w:r>
+        <w:rPr>
+          <w:lang w:val="en-GB"/>
+        </w:rPr>
+        <w:t xml:space="preserve"> , X</w:t>
+      </w:r>
     </w:p>
     <w:p>
       <w:pPr>
@@ -244,6 +310,12 @@
         </w:rPr>
         <w:t xml:space="preserve">    2.3. Tools to Support Project Management</w:t>
       </w:r>
+      <w:r>
+        <w:rPr>
+          <w:lang w:val="en-GB"/>
+        </w:rPr>
+        <w:t xml:space="preserve"> , X</w:t>
+      </w:r>
     </w:p>
     <w:p>
       <w:pPr>
@@ -257,6 +329,12 @@
         </w:rPr>
         <w:t xml:space="preserve">    2.4. Time Tracking and Effort Planning [CHANGED]</w:t>
       </w:r>
+      <w:r>
+        <w:rPr>
+          <w:lang w:val="en-GB"/>
+        </w:rPr>
+        <w:t xml:space="preserve"> , X</w:t>
+      </w:r>
     </w:p>
     <w:p>
       <w:pPr>
@@ -270,6 +348,12 @@
         </w:rPr>
         <w:t xml:space="preserve">    2.5. Risk Management</w:t>
       </w:r>
+      <w:r>
+        <w:rPr>
+          <w:lang w:val="en-GB"/>
+        </w:rPr>
+        <w:t xml:space="preserve"> , X</w:t>
+      </w:r>
     </w:p>
     <w:p>
       <w:pPr>
@@ -290,6 +374,12 @@
         </w:rPr>
         <w:t>3. Topic of this Research</w:t>
       </w:r>
+      <w:r>
+        <w:rPr>
+          <w:lang w:val="en-GB"/>
+        </w:rPr>
+        <w:t xml:space="preserve"> ,X</w:t>
+      </w:r>
     </w:p>
     <w:p>
       <w:pPr>
@@ -303,6 +393,12 @@
         </w:rPr>
         <w:t xml:space="preserve">    3.1. Previous Research and Problem Statement [CHANGED]</w:t>
       </w:r>
+      <w:r>
+        <w:rPr>
+          <w:lang w:val="en-GB"/>
+        </w:rPr>
+        <w:t xml:space="preserve"> ,X</w:t>
+      </w:r>
     </w:p>
     <w:p>
       <w:pPr>
@@ -316,6 +412,12 @@
         </w:rPr>
         <w:t xml:space="preserve">        3.1.1. Project 1 – Conceptual and Analytical Foundation [NEW]</w:t>
       </w:r>
+      <w:r>
+        <w:rPr>
+          <w:lang w:val="en-GB"/>
+        </w:rPr>
+        <w:t xml:space="preserve"> ,X</w:t>
+      </w:r>
     </w:p>
     <w:p>
       <w:pPr>
@@ -329,6 +431,12 @@
         </w:rPr>
         <w:t xml:space="preserve">        3.1.2. Project 2 – DQM Implementation and Validation [NEW]</w:t>
       </w:r>
+      <w:r>
+        <w:rPr>
+          <w:lang w:val="en-GB"/>
+        </w:rPr>
+        <w:t>, X</w:t>
+      </w:r>
     </w:p>
     <w:p>
       <w:pPr>
@@ -342,6 +450,12 @@
         </w:rPr>
         <w:t xml:space="preserve">        3.1.3. Problem Generalisation for the Master Thesis [NEW]</w:t>
       </w:r>
+      <w:r>
+        <w:rPr>
+          <w:lang w:val="en-GB"/>
+        </w:rPr>
+        <w:t>, X</w:t>
+      </w:r>
     </w:p>
     <w:p>
       <w:pPr>
@@ -362,6 +476,12 @@
         </w:rPr>
         <w:t xml:space="preserve">    3.2. Research Gap [CHANGED]</w:t>
       </w:r>
+      <w:r>
+        <w:rPr>
+          <w:lang w:val="en-GB"/>
+        </w:rPr>
+        <w:t xml:space="preserve"> ,X</w:t>
+      </w:r>
     </w:p>
     <w:p>
       <w:pPr>
@@ -382,6 +502,12 @@
         </w:rPr>
         <w:t xml:space="preserve">    3.3. Research Objective [NEW]</w:t>
       </w:r>
+      <w:r>
+        <w:rPr>
+          <w:lang w:val="en-GB"/>
+        </w:rPr>
+        <w:t>, X</w:t>
+      </w:r>
     </w:p>
     <w:p>
       <w:pPr>
@@ -402,6 +528,12 @@
         </w:rPr>
         <w:t xml:space="preserve">    3.4. Research Question [CHANGED]</w:t>
       </w:r>
+      <w:r>
+        <w:rPr>
+          <w:lang w:val="en-GB"/>
+        </w:rPr>
+        <w:t>, X</w:t>
+      </w:r>
     </w:p>
     <w:p>
       <w:pPr>
@@ -422,6 +554,12 @@
         </w:rPr>
         <w:t xml:space="preserve">    3.5. Research Hypotheses [NEW]</w:t>
       </w:r>
+      <w:r>
+        <w:rPr>
+          <w:lang w:val="en-GB"/>
+        </w:rPr>
+        <w:t>, X</w:t>
+      </w:r>
     </w:p>
     <w:p>
       <w:pPr>
@@ -442,6 +580,12 @@
         </w:rPr>
         <w:t xml:space="preserve">    3.6. Research Methodology [NEW]</w:t>
       </w:r>
+      <w:r>
+        <w:rPr>
+          <w:lang w:val="en-GB"/>
+        </w:rPr>
+        <w:t>, X</w:t>
+      </w:r>
     </w:p>
     <w:p>
       <w:pPr>
@@ -514,6 +658,12 @@
         </w:rPr>
         <w:t xml:space="preserve">    3.7. Success Definition [CHANGED]</w:t>
       </w:r>
+      <w:r>
+        <w:rPr>
+          <w:lang w:val="en-GB"/>
+        </w:rPr>
+        <w:t>, X</w:t>
+      </w:r>
     </w:p>
     <w:p>
       <w:pPr>
@@ -534,6 +684,12 @@
         </w:rPr>
         <w:t xml:space="preserve">    3.8. S.M.A.R.T. Goals [CHANGED]</w:t>
       </w:r>
+      <w:r>
+        <w:rPr>
+          <w:lang w:val="en-GB"/>
+        </w:rPr>
+        <w:t>, X</w:t>
+      </w:r>
     </w:p>
     <w:p>
       <w:pPr>
@@ -554,6 +710,12 @@
         </w:rPr>
         <w:t xml:space="preserve">    3.9. Expected Contributions [NEW]</w:t>
       </w:r>
+      <w:r>
+        <w:rPr>
+          <w:lang w:val="en-GB"/>
+        </w:rPr>
+        <w:t>, X</w:t>
+      </w:r>
     </w:p>
     <w:p>
       <w:pPr>
@@ -600,6 +762,12 @@
         </w:rPr>
         <w:t xml:space="preserve">    3.10. Expected Benefits for the Reporting Solution [CHANGED]</w:t>
       </w:r>
+      <w:r>
+        <w:rPr>
+          <w:lang w:val="en-GB"/>
+        </w:rPr>
+        <w:t>, X</w:t>
+      </w:r>
     </w:p>
     <w:p>
       <w:pPr>
@@ -626,6 +794,12 @@
           <w:lang w:val="en-GB"/>
         </w:rPr>
         <w:t>4. Solution Landscape</w:t>
+      </w:r>
+      <w:r>
+        <w:rPr>
+          <w:lang w:val="en-GB"/>
+        </w:rPr>
+        <w:t xml:space="preserve"> ,X</w:t>
       </w:r>
     </w:p>
     <w:p>
@@ -1627,14 +1801,7 @@
       <w:rPr>
         <w:lang w:val="en-GB"/>
       </w:rPr>
-      <w:t xml:space="preserve">Master Thesis Outline MSc </w:t>
-    </w:r>
-    <w:proofErr w:type="gramStart"/>
-    <w:r>
-      <w:rPr>
-        <w:lang w:val="en-GB"/>
-      </w:rPr>
-      <w:t>Master i</w:t>
+      <w:t>Master Thesis Outline MSc Master i</w:t>
     </w:r>
     <w:r>
       <w:rPr>
@@ -1642,7 +1809,6 @@
       </w:rPr>
       <w:t>n Engineering Data Science</w:t>
     </w:r>
-    <w:proofErr w:type="gramEnd"/>
     <w:r>
       <w:rPr>
         <w:lang w:val="en-GB"/>

</xml_diff>

<commit_message>
further files to have complete sections and document structure as described in initial documentation
</commit_message>
<xml_diff>
--- a/documents/Chapter_CheckList.docx
+++ b/documents/Chapter_CheckList.docx
@@ -136,32 +136,60 @@
         <w:rPr>
           <w:lang w:val="en-GB"/>
         </w:rPr>
-        <w:t xml:space="preserve">    1.4. Scope and Boundaries</w:t>
-      </w:r>
-      <w:r>
-        <w:rPr>
-          <w:lang w:val="en-GB"/>
-        </w:rPr>
-        <w:t xml:space="preserve"> , X</w:t>
-      </w:r>
-    </w:p>
-    <w:p>
-      <w:pPr>
-        <w:rPr>
-          <w:lang w:val="en-GB"/>
-        </w:rPr>
-      </w:pPr>
-      <w:r>
-        <w:rPr>
-          <w:lang w:val="en-GB"/>
-        </w:rPr>
-        <w:t xml:space="preserve">    1.5. Expected Outcome</w:t>
-      </w:r>
-      <w:r>
-        <w:rPr>
-          <w:lang w:val="en-GB"/>
-        </w:rPr>
-        <w:t xml:space="preserve"> , X</w:t>
+        <w:t xml:space="preserve">    1.4. Scope and </w:t>
+      </w:r>
+      <w:proofErr w:type="gramStart"/>
+      <w:r>
+        <w:rPr>
+          <w:lang w:val="en-GB"/>
+        </w:rPr>
+        <w:t>Boundaries</w:t>
+      </w:r>
+      <w:r>
+        <w:rPr>
+          <w:lang w:val="en-GB"/>
+        </w:rPr>
+        <w:t xml:space="preserve"> ,</w:t>
+      </w:r>
+      <w:proofErr w:type="gramEnd"/>
+      <w:r>
+        <w:rPr>
+          <w:lang w:val="en-GB"/>
+        </w:rPr>
+        <w:t xml:space="preserve"> X</w:t>
+      </w:r>
+    </w:p>
+    <w:p>
+      <w:pPr>
+        <w:rPr>
+          <w:lang w:val="en-GB"/>
+        </w:rPr>
+      </w:pPr>
+      <w:r>
+        <w:rPr>
+          <w:lang w:val="en-GB"/>
+        </w:rPr>
+        <w:t xml:space="preserve">    1.5. Expected </w:t>
+      </w:r>
+      <w:proofErr w:type="gramStart"/>
+      <w:r>
+        <w:rPr>
+          <w:lang w:val="en-GB"/>
+        </w:rPr>
+        <w:t>Outcome</w:t>
+      </w:r>
+      <w:r>
+        <w:rPr>
+          <w:lang w:val="en-GB"/>
+        </w:rPr>
+        <w:t xml:space="preserve"> ,</w:t>
+      </w:r>
+      <w:proofErr w:type="gramEnd"/>
+      <w:r>
+        <w:rPr>
+          <w:lang w:val="en-GB"/>
+        </w:rPr>
+        <w:t xml:space="preserve"> X</w:t>
       </w:r>
     </w:p>
     <w:p>
@@ -213,7 +241,14 @@
         <w:rPr>
           <w:lang w:val="en-GB"/>
         </w:rPr>
-        <w:t xml:space="preserve">    2.1. Team Constellation</w:t>
+        <w:t xml:space="preserve">    2.1. Team </w:t>
+      </w:r>
+      <w:proofErr w:type="gramStart"/>
+      <w:r>
+        <w:rPr>
+          <w:lang w:val="en-GB"/>
+        </w:rPr>
+        <w:t>Constellation</w:t>
       </w:r>
       <w:r>
         <w:rPr>
@@ -221,158 +256,264 @@
         </w:rPr>
         <w:t xml:space="preserve"> ,X</w:t>
       </w:r>
-    </w:p>
-    <w:p>
-      <w:pPr>
-        <w:rPr>
-          <w:lang w:val="en-GB"/>
-        </w:rPr>
-      </w:pPr>
-      <w:r>
-        <w:rPr>
-          <w:lang w:val="en-GB"/>
-        </w:rPr>
-        <w:t xml:space="preserve">    2.2. Project Management Methodologies</w:t>
-      </w:r>
-      <w:r>
-        <w:rPr>
-          <w:lang w:val="en-GB"/>
-        </w:rPr>
-        <w:t xml:space="preserve"> , X</w:t>
-      </w:r>
-    </w:p>
-    <w:p>
-      <w:pPr>
-        <w:rPr>
-          <w:lang w:val="en-GB"/>
-        </w:rPr>
-      </w:pPr>
-      <w:r>
-        <w:rPr>
-          <w:lang w:val="en-GB"/>
-        </w:rPr>
-        <w:t xml:space="preserve">        2.2.1. Agile and Iterative Approach [CHANGED]</w:t>
-      </w:r>
-      <w:r>
-        <w:rPr>
-          <w:lang w:val="en-GB"/>
-        </w:rPr>
-        <w:t xml:space="preserve"> , X</w:t>
-      </w:r>
-    </w:p>
-    <w:p>
-      <w:pPr>
-        <w:rPr>
-          <w:lang w:val="en-GB"/>
-        </w:rPr>
-      </w:pPr>
-      <w:r>
-        <w:rPr>
-          <w:lang w:val="en-GB"/>
-        </w:rPr>
-        <w:t xml:space="preserve">        2.2.2. Project Plan and Work Packages [NEW]</w:t>
-      </w:r>
-      <w:r>
-        <w:rPr>
-          <w:lang w:val="en-GB"/>
-        </w:rPr>
-        <w:t xml:space="preserve"> , X</w:t>
-      </w:r>
-    </w:p>
-    <w:p>
-      <w:pPr>
-        <w:rPr>
-          <w:lang w:val="en-GB"/>
-        </w:rPr>
-      </w:pPr>
-      <w:r>
-        <w:rPr>
-          <w:lang w:val="en-GB"/>
-        </w:rPr>
-        <w:t xml:space="preserve">        2.2.3. Milestones [CHANGED]</w:t>
-      </w:r>
-      <w:r>
-        <w:rPr>
-          <w:lang w:val="en-GB"/>
-        </w:rPr>
-        <w:t xml:space="preserve"> , X</w:t>
-      </w:r>
-    </w:p>
-    <w:p>
-      <w:pPr>
-        <w:rPr>
-          <w:lang w:val="en-GB"/>
-        </w:rPr>
-      </w:pPr>
-      <w:r>
-        <w:rPr>
-          <w:lang w:val="en-GB"/>
-        </w:rPr>
-        <w:t xml:space="preserve">    2.3. Tools to Support Project Management</w:t>
-      </w:r>
-      <w:r>
-        <w:rPr>
-          <w:lang w:val="en-GB"/>
-        </w:rPr>
-        <w:t xml:space="preserve"> , X</w:t>
-      </w:r>
-    </w:p>
-    <w:p>
-      <w:pPr>
-        <w:rPr>
-          <w:lang w:val="en-GB"/>
-        </w:rPr>
-      </w:pPr>
-      <w:r>
-        <w:rPr>
-          <w:lang w:val="en-GB"/>
-        </w:rPr>
-        <w:t xml:space="preserve">    2.4. Time Tracking and Effort Planning [CHANGED]</w:t>
-      </w:r>
-      <w:r>
-        <w:rPr>
-          <w:lang w:val="en-GB"/>
-        </w:rPr>
-        <w:t xml:space="preserve"> , X</w:t>
-      </w:r>
-    </w:p>
-    <w:p>
-      <w:pPr>
-        <w:rPr>
-          <w:lang w:val="en-GB"/>
-        </w:rPr>
-      </w:pPr>
-      <w:r>
-        <w:rPr>
-          <w:lang w:val="en-GB"/>
-        </w:rPr>
-        <w:t xml:space="preserve">    2.5. Risk Management</w:t>
-      </w:r>
-      <w:r>
-        <w:rPr>
-          <w:lang w:val="en-GB"/>
-        </w:rPr>
-        <w:t xml:space="preserve"> , X</w:t>
-      </w:r>
-    </w:p>
-    <w:p>
-      <w:pPr>
-        <w:rPr>
-          <w:lang w:val="en-GB"/>
-        </w:rPr>
-      </w:pPr>
-    </w:p>
-    <w:p>
-      <w:pPr>
-        <w:rPr>
-          <w:lang w:val="en-GB"/>
-        </w:rPr>
-      </w:pPr>
-      <w:r>
-        <w:rPr>
-          <w:lang w:val="en-GB"/>
-        </w:rPr>
-        <w:t>3. Topic of this Research</w:t>
+      <w:proofErr w:type="gramEnd"/>
+    </w:p>
+    <w:p>
+      <w:pPr>
+        <w:rPr>
+          <w:lang w:val="en-GB"/>
+        </w:rPr>
+      </w:pPr>
+      <w:r>
+        <w:rPr>
+          <w:lang w:val="en-GB"/>
+        </w:rPr>
+        <w:t xml:space="preserve">    2.2. Project Management </w:t>
+      </w:r>
+      <w:proofErr w:type="gramStart"/>
+      <w:r>
+        <w:rPr>
+          <w:lang w:val="en-GB"/>
+        </w:rPr>
+        <w:t>Methodologies</w:t>
+      </w:r>
+      <w:r>
+        <w:rPr>
+          <w:lang w:val="en-GB"/>
+        </w:rPr>
+        <w:t xml:space="preserve"> ,</w:t>
+      </w:r>
+      <w:proofErr w:type="gramEnd"/>
+      <w:r>
+        <w:rPr>
+          <w:lang w:val="en-GB"/>
+        </w:rPr>
+        <w:t xml:space="preserve"> X</w:t>
+      </w:r>
+    </w:p>
+    <w:p>
+      <w:pPr>
+        <w:rPr>
+          <w:lang w:val="en-GB"/>
+        </w:rPr>
+      </w:pPr>
+      <w:r>
+        <w:rPr>
+          <w:lang w:val="en-GB"/>
+        </w:rPr>
+        <w:t xml:space="preserve">        2.2.1. Agile and Iterative Approach [CHANGED</w:t>
+      </w:r>
+      <w:proofErr w:type="gramStart"/>
+      <w:r>
+        <w:rPr>
+          <w:lang w:val="en-GB"/>
+        </w:rPr>
+        <w:t>]</w:t>
+      </w:r>
+      <w:r>
+        <w:rPr>
+          <w:lang w:val="en-GB"/>
+        </w:rPr>
+        <w:t xml:space="preserve"> ,</w:t>
+      </w:r>
+      <w:proofErr w:type="gramEnd"/>
+      <w:r>
+        <w:rPr>
+          <w:lang w:val="en-GB"/>
+        </w:rPr>
+        <w:t xml:space="preserve"> X</w:t>
+      </w:r>
+    </w:p>
+    <w:p>
+      <w:pPr>
+        <w:rPr>
+          <w:lang w:val="en-GB"/>
+        </w:rPr>
+      </w:pPr>
+      <w:r>
+        <w:rPr>
+          <w:lang w:val="en-GB"/>
+        </w:rPr>
+        <w:t xml:space="preserve">        2.2.2. Project Plan and Work Packages [NEW</w:t>
+      </w:r>
+      <w:proofErr w:type="gramStart"/>
+      <w:r>
+        <w:rPr>
+          <w:lang w:val="en-GB"/>
+        </w:rPr>
+        <w:t>]</w:t>
+      </w:r>
+      <w:r>
+        <w:rPr>
+          <w:lang w:val="en-GB"/>
+        </w:rPr>
+        <w:t xml:space="preserve"> ,</w:t>
+      </w:r>
+      <w:proofErr w:type="gramEnd"/>
+      <w:r>
+        <w:rPr>
+          <w:lang w:val="en-GB"/>
+        </w:rPr>
+        <w:t xml:space="preserve"> X</w:t>
+      </w:r>
+    </w:p>
+    <w:p>
+      <w:pPr>
+        <w:rPr>
+          <w:lang w:val="en-GB"/>
+        </w:rPr>
+      </w:pPr>
+      <w:r>
+        <w:rPr>
+          <w:lang w:val="en-GB"/>
+        </w:rPr>
+        <w:t xml:space="preserve">        2.2.3. Milestones [CHANGED</w:t>
+      </w:r>
+      <w:proofErr w:type="gramStart"/>
+      <w:r>
+        <w:rPr>
+          <w:lang w:val="en-GB"/>
+        </w:rPr>
+        <w:t>]</w:t>
+      </w:r>
+      <w:r>
+        <w:rPr>
+          <w:lang w:val="en-GB"/>
+        </w:rPr>
+        <w:t xml:space="preserve"> ,</w:t>
+      </w:r>
+      <w:proofErr w:type="gramEnd"/>
+      <w:r>
+        <w:rPr>
+          <w:lang w:val="en-GB"/>
+        </w:rPr>
+        <w:t xml:space="preserve"> X</w:t>
+      </w:r>
+    </w:p>
+    <w:p>
+      <w:pPr>
+        <w:rPr>
+          <w:lang w:val="en-GB"/>
+        </w:rPr>
+      </w:pPr>
+      <w:r>
+        <w:rPr>
+          <w:lang w:val="en-GB"/>
+        </w:rPr>
+        <w:t xml:space="preserve">    2.3. Tools to Support Project </w:t>
+      </w:r>
+      <w:proofErr w:type="gramStart"/>
+      <w:r>
+        <w:rPr>
+          <w:lang w:val="en-GB"/>
+        </w:rPr>
+        <w:t>Management</w:t>
+      </w:r>
+      <w:r>
+        <w:rPr>
+          <w:lang w:val="en-GB"/>
+        </w:rPr>
+        <w:t xml:space="preserve"> ,</w:t>
+      </w:r>
+      <w:proofErr w:type="gramEnd"/>
+      <w:r>
+        <w:rPr>
+          <w:lang w:val="en-GB"/>
+        </w:rPr>
+        <w:t xml:space="preserve"> X</w:t>
+      </w:r>
+    </w:p>
+    <w:p>
+      <w:pPr>
+        <w:rPr>
+          <w:lang w:val="en-GB"/>
+        </w:rPr>
+      </w:pPr>
+      <w:r>
+        <w:rPr>
+          <w:lang w:val="en-GB"/>
+        </w:rPr>
+        <w:t xml:space="preserve">    2.4. Time Tracking and Effort Planning [CHANGED</w:t>
+      </w:r>
+      <w:proofErr w:type="gramStart"/>
+      <w:r>
+        <w:rPr>
+          <w:lang w:val="en-GB"/>
+        </w:rPr>
+        <w:t>]</w:t>
+      </w:r>
+      <w:r>
+        <w:rPr>
+          <w:lang w:val="en-GB"/>
+        </w:rPr>
+        <w:t xml:space="preserve"> ,</w:t>
+      </w:r>
+      <w:proofErr w:type="gramEnd"/>
+      <w:r>
+        <w:rPr>
+          <w:lang w:val="en-GB"/>
+        </w:rPr>
+        <w:t xml:space="preserve"> X</w:t>
+      </w:r>
+    </w:p>
+    <w:p>
+      <w:pPr>
+        <w:rPr>
+          <w:lang w:val="en-GB"/>
+        </w:rPr>
+      </w:pPr>
+      <w:r>
+        <w:rPr>
+          <w:lang w:val="en-GB"/>
+        </w:rPr>
+        <w:t xml:space="preserve">    2.5. Risk </w:t>
+      </w:r>
+      <w:proofErr w:type="gramStart"/>
+      <w:r>
+        <w:rPr>
+          <w:lang w:val="en-GB"/>
+        </w:rPr>
+        <w:t>Management</w:t>
+      </w:r>
+      <w:r>
+        <w:rPr>
+          <w:lang w:val="en-GB"/>
+        </w:rPr>
+        <w:t xml:space="preserve"> ,</w:t>
+      </w:r>
+      <w:proofErr w:type="gramEnd"/>
+      <w:r>
+        <w:rPr>
+          <w:lang w:val="en-GB"/>
+        </w:rPr>
+        <w:t xml:space="preserve"> X</w:t>
+      </w:r>
+    </w:p>
+    <w:p>
+      <w:pPr>
+        <w:rPr>
+          <w:lang w:val="en-GB"/>
+        </w:rPr>
+      </w:pPr>
+    </w:p>
+    <w:p>
+      <w:pPr>
+        <w:rPr>
+          <w:lang w:val="en-GB"/>
+        </w:rPr>
+      </w:pPr>
+      <w:r>
+        <w:rPr>
+          <w:lang w:val="en-GB"/>
+        </w:rPr>
+        <w:t xml:space="preserve">3. Topic of this </w:t>
+      </w:r>
+      <w:proofErr w:type="gramStart"/>
+      <w:r>
+        <w:rPr>
+          <w:lang w:val="en-GB"/>
+        </w:rPr>
+        <w:t>Research</w:t>
       </w:r>
       <w:r>
         <w:rPr>
@@ -380,18 +521,26 @@
         </w:rPr>
         <w:t xml:space="preserve"> ,X</w:t>
       </w:r>
-    </w:p>
-    <w:p>
-      <w:pPr>
-        <w:rPr>
-          <w:lang w:val="en-GB"/>
-        </w:rPr>
-      </w:pPr>
-      <w:r>
-        <w:rPr>
-          <w:lang w:val="en-GB"/>
-        </w:rPr>
-        <w:t xml:space="preserve">    3.1. Previous Research and Problem Statement [CHANGED]</w:t>
+      <w:proofErr w:type="gramEnd"/>
+    </w:p>
+    <w:p>
+      <w:pPr>
+        <w:rPr>
+          <w:lang w:val="en-GB"/>
+        </w:rPr>
+      </w:pPr>
+      <w:r>
+        <w:rPr>
+          <w:lang w:val="en-GB"/>
+        </w:rPr>
+        <w:t xml:space="preserve">    3.1. Previous Research and Problem Statement [CHANGED</w:t>
+      </w:r>
+      <w:proofErr w:type="gramStart"/>
+      <w:r>
+        <w:rPr>
+          <w:lang w:val="en-GB"/>
+        </w:rPr>
+        <w:t>]</w:t>
       </w:r>
       <w:r>
         <w:rPr>
@@ -399,18 +548,26 @@
         </w:rPr>
         <w:t xml:space="preserve"> ,X</w:t>
       </w:r>
-    </w:p>
-    <w:p>
-      <w:pPr>
-        <w:rPr>
-          <w:lang w:val="en-GB"/>
-        </w:rPr>
-      </w:pPr>
-      <w:r>
-        <w:rPr>
-          <w:lang w:val="en-GB"/>
-        </w:rPr>
-        <w:t xml:space="preserve">        3.1.1. Project 1 – Conceptual and Analytical Foundation [NEW]</w:t>
+      <w:proofErr w:type="gramEnd"/>
+    </w:p>
+    <w:p>
+      <w:pPr>
+        <w:rPr>
+          <w:lang w:val="en-GB"/>
+        </w:rPr>
+      </w:pPr>
+      <w:r>
+        <w:rPr>
+          <w:lang w:val="en-GB"/>
+        </w:rPr>
+        <w:t xml:space="preserve">        3.1.1. Project 1 – Conceptual and Analytical Foundation [NEW</w:t>
+      </w:r>
+      <w:proofErr w:type="gramStart"/>
+      <w:r>
+        <w:rPr>
+          <w:lang w:val="en-GB"/>
+        </w:rPr>
+        <w:t>]</w:t>
       </w:r>
       <w:r>
         <w:rPr>
@@ -418,6 +575,7 @@
         </w:rPr>
         <w:t xml:space="preserve"> ,X</w:t>
       </w:r>
+      <w:proofErr w:type="gramEnd"/>
     </w:p>
     <w:p>
       <w:pPr>
@@ -474,7 +632,14 @@
         <w:rPr>
           <w:lang w:val="en-GB"/>
         </w:rPr>
-        <w:t xml:space="preserve">    3.2. Research Gap [CHANGED]</w:t>
+        <w:t xml:space="preserve">    3.2. Research Gap [CHANGED</w:t>
+      </w:r>
+      <w:proofErr w:type="gramStart"/>
+      <w:r>
+        <w:rPr>
+          <w:lang w:val="en-GB"/>
+        </w:rPr>
+        <w:t>]</w:t>
       </w:r>
       <w:r>
         <w:rPr>
@@ -482,6 +647,7 @@
         </w:rPr>
         <w:t xml:space="preserve"> ,X</w:t>
       </w:r>
+      <w:proofErr w:type="gramEnd"/>
     </w:p>
     <w:p>
       <w:pPr>
@@ -793,7 +959,14 @@
         <w:rPr>
           <w:lang w:val="en-GB"/>
         </w:rPr>
-        <w:t>4. Solution Landscape</w:t>
+        <w:t xml:space="preserve">4. Solution </w:t>
+      </w:r>
+      <w:proofErr w:type="gramStart"/>
+      <w:r>
+        <w:rPr>
+          <w:lang w:val="en-GB"/>
+        </w:rPr>
+        <w:t>Landscape</w:t>
       </w:r>
       <w:r>
         <w:rPr>
@@ -801,6 +974,7 @@
         </w:rPr>
         <w:t xml:space="preserve"> ,X</w:t>
       </w:r>
+      <w:proofErr w:type="gramEnd"/>
     </w:p>
     <w:p>
       <w:pPr>
@@ -814,6 +988,12 @@
         </w:rPr>
         <w:t xml:space="preserve">    4.1. Data Quality Management at Swiss Post</w:t>
       </w:r>
+      <w:r>
+        <w:rPr>
+          <w:lang w:val="en-GB"/>
+        </w:rPr>
+        <w:t>, X</w:t>
+      </w:r>
     </w:p>
     <w:p>
       <w:pPr>
@@ -827,32 +1007,106 @@
         </w:rPr>
         <w:t xml:space="preserve">    4.2. Existing Rule-Based DQM Initiative</w:t>
       </w:r>
-    </w:p>
-    <w:p>
-      <w:pPr>
-        <w:rPr>
-          <w:lang w:val="en-GB"/>
-        </w:rPr>
-      </w:pPr>
-      <w:r>
-        <w:rPr>
-          <w:lang w:val="en-GB"/>
-        </w:rPr>
-        <w:t xml:space="preserve">    4.3. Heterogeneous Sorting Centre Environments</w:t>
-      </w:r>
-    </w:p>
-    <w:p>
-      <w:pPr>
-        <w:rPr>
-          <w:lang w:val="en-GB"/>
-        </w:rPr>
-      </w:pPr>
-      <w:r>
-        <w:rPr>
-          <w:lang w:val="en-GB"/>
-        </w:rPr>
-        <w:t xml:space="preserve">    4.4. Data Lineage</w:t>
-      </w:r>
+      <w:r>
+        <w:rPr>
+          <w:lang w:val="en-GB"/>
+        </w:rPr>
+        <w:t>, X</w:t>
+      </w:r>
+    </w:p>
+    <w:p>
+      <w:pPr>
+        <w:rPr>
+          <w:lang w:val="fr-CH"/>
+        </w:rPr>
+      </w:pPr>
+      <w:r>
+        <w:rPr>
+          <w:lang w:val="en-GB"/>
+        </w:rPr>
+        <w:t xml:space="preserve">    </w:t>
+      </w:r>
+      <w:r>
+        <w:rPr>
+          <w:lang w:val="fr-CH"/>
+        </w:rPr>
+        <w:t xml:space="preserve">4.3. </w:t>
+      </w:r>
+      <w:proofErr w:type="spellStart"/>
+      <w:r>
+        <w:rPr>
+          <w:lang w:val="fr-CH"/>
+        </w:rPr>
+        <w:t>Heterogeneous</w:t>
+      </w:r>
+      <w:proofErr w:type="spellEnd"/>
+      <w:r>
+        <w:rPr>
+          <w:lang w:val="fr-CH"/>
+        </w:rPr>
+        <w:t xml:space="preserve"> </w:t>
+      </w:r>
+      <w:proofErr w:type="spellStart"/>
+      <w:r>
+        <w:rPr>
+          <w:lang w:val="fr-CH"/>
+        </w:rPr>
+        <w:t>Sorting</w:t>
+      </w:r>
+      <w:proofErr w:type="spellEnd"/>
+      <w:r>
+        <w:rPr>
+          <w:lang w:val="fr-CH"/>
+        </w:rPr>
+        <w:t xml:space="preserve"> Centre </w:t>
+      </w:r>
+      <w:proofErr w:type="spellStart"/>
+      <w:r>
+        <w:rPr>
+          <w:lang w:val="fr-CH"/>
+        </w:rPr>
+        <w:t>Environments</w:t>
+      </w:r>
+      <w:proofErr w:type="spellEnd"/>
+      <w:r>
+        <w:rPr>
+          <w:lang w:val="fr-CH"/>
+        </w:rPr>
+        <w:t>, X</w:t>
+      </w:r>
+    </w:p>
+    <w:p>
+      <w:pPr>
+        <w:rPr>
+          <w:lang w:val="en-GB"/>
+        </w:rPr>
+      </w:pPr>
+      <w:r>
+        <w:rPr>
+          <w:lang w:val="fr-CH"/>
+        </w:rPr>
+        <w:t xml:space="preserve">    </w:t>
+      </w:r>
+      <w:r>
+        <w:rPr>
+          <w:lang w:val="en-GB"/>
+        </w:rPr>
+        <w:t xml:space="preserve">4.4. Data </w:t>
+      </w:r>
+      <w:proofErr w:type="gramStart"/>
+      <w:r>
+        <w:rPr>
+          <w:lang w:val="en-GB"/>
+        </w:rPr>
+        <w:t>Lineage</w:t>
+      </w:r>
+      <w:r>
+        <w:rPr>
+          <w:lang w:val="en-GB"/>
+        </w:rPr>
+        <w:t xml:space="preserve"> ,X</w:t>
+      </w:r>
+      <w:proofErr w:type="gramEnd"/>
     </w:p>
     <w:p>
       <w:pPr>
@@ -866,6 +1120,12 @@
         </w:rPr>
         <w:t xml:space="preserve">    4.5. Existing Reporting Pipeline</w:t>
       </w:r>
+      <w:r>
+        <w:rPr>
+          <w:lang w:val="en-GB"/>
+        </w:rPr>
+        <w:t>, X</w:t>
+      </w:r>
     </w:p>
     <w:p>
       <w:pPr>
@@ -878,6 +1138,12 @@
           <w:lang w:val="en-GB"/>
         </w:rPr>
         <w:t xml:space="preserve">    4.6. Existing Data Quality Reporting and Visualisation</w:t>
+      </w:r>
+      <w:r>
+        <w:rPr>
+          <w:lang w:val="en-GB"/>
+        </w:rPr>
+        <w:t>, X</w:t>
       </w:r>
     </w:p>
     <w:p>
@@ -893,59 +1159,113 @@
         <w:lastRenderedPageBreak/>
         <w:t xml:space="preserve">    4.7. Existing DQM Platform and Infrastructure [CHANGED]</w:t>
       </w:r>
-    </w:p>
-    <w:p>
-      <w:pPr>
-        <w:rPr>
-          <w:lang w:val="en-GB"/>
-        </w:rPr>
-      </w:pPr>
-      <w:r>
-        <w:rPr>
-          <w:lang w:val="en-GB"/>
-        </w:rPr>
-        <w:t xml:space="preserve">    4.8. Baseline for the Master Thesis [NEW]</w:t>
-      </w:r>
-    </w:p>
-    <w:p>
-      <w:pPr>
-        <w:rPr>
-          <w:lang w:val="en-GB"/>
-        </w:rPr>
-      </w:pPr>
-    </w:p>
-    <w:p>
-      <w:pPr>
-        <w:rPr>
-          <w:lang w:val="en-GB"/>
-        </w:rPr>
-      </w:pPr>
-    </w:p>
-    <w:p>
-      <w:pPr>
-        <w:rPr>
-          <w:lang w:val="en-GB"/>
-        </w:rPr>
-      </w:pPr>
-      <w:r>
-        <w:rPr>
-          <w:lang w:val="en-GB"/>
-        </w:rPr>
-        <w:t>5. Implementation</w:t>
-      </w:r>
-    </w:p>
-    <w:p>
-      <w:pPr>
-        <w:rPr>
-          <w:lang w:val="en-GB"/>
-        </w:rPr>
-      </w:pPr>
-      <w:r>
-        <w:rPr>
-          <w:lang w:val="en-GB"/>
-        </w:rPr>
-        <w:t xml:space="preserve">    5.1. Technical and Experimental Setup [CHANGED]</w:t>
-      </w:r>
+      <w:r>
+        <w:rPr>
+          <w:lang w:val="en-GB"/>
+        </w:rPr>
+        <w:t>, X</w:t>
+      </w:r>
+    </w:p>
+    <w:p>
+      <w:pPr>
+        <w:rPr>
+          <w:lang w:val="en-GB"/>
+        </w:rPr>
+      </w:pPr>
+      <w:r>
+        <w:rPr>
+          <w:lang w:val="en-GB"/>
+        </w:rPr>
+        <w:t xml:space="preserve">    4.8. Baseline for the Master Thesis [NEW</w:t>
+      </w:r>
+      <w:proofErr w:type="gramStart"/>
+      <w:r>
+        <w:rPr>
+          <w:lang w:val="en-GB"/>
+        </w:rPr>
+        <w:t>]</w:t>
+      </w:r>
+      <w:r>
+        <w:rPr>
+          <w:lang w:val="en-GB"/>
+        </w:rPr>
+        <w:t xml:space="preserve"> ,X</w:t>
+      </w:r>
+      <w:proofErr w:type="gramEnd"/>
+    </w:p>
+    <w:p>
+      <w:pPr>
+        <w:rPr>
+          <w:lang w:val="en-GB"/>
+        </w:rPr>
+      </w:pPr>
+    </w:p>
+    <w:p>
+      <w:pPr>
+        <w:rPr>
+          <w:lang w:val="en-GB"/>
+        </w:rPr>
+      </w:pPr>
+    </w:p>
+    <w:p>
+      <w:pPr>
+        <w:rPr>
+          <w:lang w:val="en-GB"/>
+        </w:rPr>
+      </w:pPr>
+      <w:r>
+        <w:rPr>
+          <w:lang w:val="en-GB"/>
+        </w:rPr>
+        <w:t xml:space="preserve">5. </w:t>
+      </w:r>
+      <w:proofErr w:type="gramStart"/>
+      <w:r>
+        <w:rPr>
+          <w:lang w:val="en-GB"/>
+        </w:rPr>
+        <w:t>Implementation</w:t>
+      </w:r>
+      <w:r>
+        <w:rPr>
+          <w:lang w:val="en-GB"/>
+        </w:rPr>
+        <w:t xml:space="preserve"> ,</w:t>
+      </w:r>
+      <w:proofErr w:type="gramEnd"/>
+      <w:r>
+        <w:rPr>
+          <w:lang w:val="en-GB"/>
+        </w:rPr>
+        <w:t xml:space="preserve"> X</w:t>
+      </w:r>
+    </w:p>
+    <w:p>
+      <w:pPr>
+        <w:rPr>
+          <w:lang w:val="en-GB"/>
+        </w:rPr>
+      </w:pPr>
+      <w:r>
+        <w:rPr>
+          <w:lang w:val="en-GB"/>
+        </w:rPr>
+        <w:t xml:space="preserve">    5.1. Technical and Experimental Setup [CHANGED</w:t>
+      </w:r>
+      <w:proofErr w:type="gramStart"/>
+      <w:r>
+        <w:rPr>
+          <w:lang w:val="en-GB"/>
+        </w:rPr>
+        <w:t>]</w:t>
+      </w:r>
+      <w:r>
+        <w:rPr>
+          <w:lang w:val="en-GB"/>
+        </w:rPr>
+        <w:t xml:space="preserve"> ,X</w:t>
+      </w:r>
+      <w:proofErr w:type="gramEnd"/>
     </w:p>
     <w:p>
       <w:pPr>
@@ -988,33 +1308,81 @@
         <w:rPr>
           <w:lang w:val="en-GB"/>
         </w:rPr>
-        <w:t xml:space="preserve"> [CHANGED]</w:t>
-      </w:r>
-    </w:p>
-    <w:p>
-      <w:pPr>
-        <w:rPr>
-          <w:lang w:val="en-GB"/>
-        </w:rPr>
-      </w:pPr>
-      <w:r>
-        <w:rPr>
-          <w:lang w:val="en-GB"/>
-        </w:rPr>
-        <w:t xml:space="preserve">        5.2.1. Design</w:t>
-      </w:r>
-    </w:p>
-    <w:p>
-      <w:pPr>
-        <w:rPr>
-          <w:lang w:val="en-GB"/>
-        </w:rPr>
-      </w:pPr>
-      <w:r>
-        <w:rPr>
-          <w:lang w:val="en-GB"/>
-        </w:rPr>
-        <w:t xml:space="preserve">        5.2.2. Implementation</w:t>
+        <w:t xml:space="preserve"> [CHANGED</w:t>
+      </w:r>
+      <w:proofErr w:type="gramStart"/>
+      <w:r>
+        <w:rPr>
+          <w:lang w:val="en-GB"/>
+        </w:rPr>
+        <w:t>]</w:t>
+      </w:r>
+      <w:r>
+        <w:rPr>
+          <w:lang w:val="en-GB"/>
+        </w:rPr>
+        <w:t>,X</w:t>
+      </w:r>
+      <w:proofErr w:type="gramEnd"/>
+    </w:p>
+    <w:p>
+      <w:pPr>
+        <w:rPr>
+          <w:lang w:val="en-GB"/>
+        </w:rPr>
+      </w:pPr>
+      <w:r>
+        <w:rPr>
+          <w:lang w:val="en-GB"/>
+        </w:rPr>
+        <w:t xml:space="preserve">        5.2.1. </w:t>
+      </w:r>
+      <w:proofErr w:type="gramStart"/>
+      <w:r>
+        <w:rPr>
+          <w:lang w:val="en-GB"/>
+        </w:rPr>
+        <w:t>Design</w:t>
+      </w:r>
+      <w:r>
+        <w:rPr>
+          <w:lang w:val="en-GB"/>
+        </w:rPr>
+        <w:t xml:space="preserve"> ,X</w:t>
+      </w:r>
+      <w:proofErr w:type="gramEnd"/>
+    </w:p>
+    <w:p>
+      <w:pPr>
+        <w:rPr>
+          <w:lang w:val="en-GB"/>
+        </w:rPr>
+      </w:pPr>
+      <w:r>
+        <w:rPr>
+          <w:lang w:val="en-GB"/>
+        </w:rPr>
+        <w:t xml:space="preserve">        5.2.2. </w:t>
+      </w:r>
+      <w:proofErr w:type="gramStart"/>
+      <w:r>
+        <w:rPr>
+          <w:lang w:val="en-GB"/>
+        </w:rPr>
+        <w:t>Implementation</w:t>
+      </w:r>
+      <w:r>
+        <w:rPr>
+          <w:lang w:val="en-GB"/>
+        </w:rPr>
+        <w:t xml:space="preserve"> ,</w:t>
+      </w:r>
+      <w:proofErr w:type="gramEnd"/>
+      <w:r>
+        <w:rPr>
+          <w:lang w:val="en-GB"/>
+        </w:rPr>
+        <w:t xml:space="preserve"> X</w:t>
       </w:r>
     </w:p>
     <w:p>
@@ -1029,6 +1397,12 @@
         </w:rPr>
         <w:t xml:space="preserve">        5.2.3. Technical Validation</w:t>
       </w:r>
+      <w:r>
+        <w:rPr>
+          <w:lang w:val="en-GB"/>
+        </w:rPr>
+        <w:t>, X</w:t>
+      </w:r>
     </w:p>
     <w:p>
       <w:pPr>
@@ -1071,7 +1445,27 @@
         <w:rPr>
           <w:lang w:val="en-GB"/>
         </w:rPr>
-        <w:t xml:space="preserve"> [NEW]</w:t>
+        <w:t xml:space="preserve"> [NEW</w:t>
+      </w:r>
+      <w:proofErr w:type="gramStart"/>
+      <w:r>
+        <w:rPr>
+          <w:lang w:val="en-GB"/>
+        </w:rPr>
+        <w:t>]</w:t>
+      </w:r>
+      <w:r>
+        <w:rPr>
+          <w:lang w:val="en-GB"/>
+        </w:rPr>
+        <w:t xml:space="preserve"> ,</w:t>
+      </w:r>
+      <w:proofErr w:type="gramEnd"/>
+      <w:r>
+        <w:rPr>
+          <w:lang w:val="en-GB"/>
+        </w:rPr>
+        <w:t xml:space="preserve"> X</w:t>
       </w:r>
     </w:p>
     <w:p>
@@ -1086,188 +1480,173 @@
         </w:rPr>
         <w:t xml:space="preserve">        5.3.1. Design</w:t>
       </w:r>
-    </w:p>
-    <w:p>
-      <w:pPr>
-        <w:rPr>
-          <w:lang w:val="en-GB"/>
-        </w:rPr>
-      </w:pPr>
-      <w:r>
-        <w:rPr>
-          <w:lang w:val="en-GB"/>
-        </w:rPr>
-        <w:t xml:space="preserve">        5.3.2. Implementation</w:t>
-      </w:r>
-    </w:p>
-    <w:p>
-      <w:pPr>
-        <w:rPr>
-          <w:lang w:val="en-GB"/>
-        </w:rPr>
-      </w:pPr>
-      <w:r>
-        <w:rPr>
-          <w:lang w:val="en-GB"/>
-        </w:rPr>
-        <w:t xml:space="preserve">        5.3.3. Technical Validation</w:t>
-      </w:r>
-    </w:p>
-    <w:p>
-      <w:pPr>
-        <w:rPr>
-          <w:lang w:val="en-GB"/>
-        </w:rPr>
-      </w:pPr>
-    </w:p>
-    <w:p>
-      <w:pPr>
-        <w:rPr>
-          <w:lang w:val="en-GB"/>
-        </w:rPr>
-      </w:pPr>
-      <w:r>
-        <w:rPr>
-          <w:lang w:val="en-GB"/>
-        </w:rPr>
-        <w:t xml:space="preserve">    5.4. Advanced </w:t>
-      </w:r>
-      <w:r>
-        <w:rPr>
-          <w:lang w:val="en-GB"/>
-        </w:rPr>
-        <w:t xml:space="preserve">Detection </w:t>
-      </w:r>
-      <w:r>
-        <w:rPr>
-          <w:lang w:val="en-GB"/>
-        </w:rPr>
-        <w:t>Approach</w:t>
-      </w:r>
-      <w:r>
-        <w:rPr>
-          <w:lang w:val="en-GB"/>
-        </w:rPr>
-        <w:t>, (ML/Own / Extended first second approach / New Ideas… alternative implementation when 1 2 failed)</w:t>
-      </w:r>
-      <w:r>
-        <w:rPr>
-          <w:lang w:val="en-GB"/>
-        </w:rPr>
-        <w:t xml:space="preserve"> [NEW]</w:t>
-      </w:r>
-    </w:p>
-    <w:p>
-      <w:pPr>
-        <w:rPr>
-          <w:lang w:val="en-GB"/>
-        </w:rPr>
-      </w:pPr>
-      <w:r>
-        <w:rPr>
-          <w:lang w:val="en-GB"/>
-        </w:rPr>
-        <w:t xml:space="preserve">        5.4.1. Selection of Approach</w:t>
-      </w:r>
-    </w:p>
-    <w:p>
-      <w:pPr>
-        <w:rPr>
-          <w:lang w:val="en-GB"/>
-        </w:rPr>
-      </w:pPr>
-      <w:r>
-        <w:rPr>
-          <w:lang w:val="en-GB"/>
-        </w:rPr>
-        <w:t xml:space="preserve">        5.4.2. Design</w:t>
-      </w:r>
-    </w:p>
-    <w:p>
-      <w:pPr>
-        <w:rPr>
-          <w:lang w:val="en-GB"/>
-        </w:rPr>
-      </w:pPr>
-      <w:r>
-        <w:rPr>
-          <w:lang w:val="en-GB"/>
-        </w:rPr>
-        <w:t xml:space="preserve">        5.4.3. Implementation</w:t>
-      </w:r>
-    </w:p>
-    <w:p>
-      <w:pPr>
-        <w:rPr>
-          <w:lang w:val="en-GB"/>
-        </w:rPr>
-      </w:pPr>
-      <w:r>
-        <w:rPr>
-          <w:lang w:val="en-GB"/>
-        </w:rPr>
-        <w:t xml:space="preserve">        5.4.4. Technical Validation</w:t>
-      </w:r>
-    </w:p>
-    <w:p>
-      <w:pPr>
-        <w:rPr>
-          <w:lang w:val="en-GB"/>
-        </w:rPr>
-      </w:pPr>
-    </w:p>
-    <w:p>
-      <w:pPr>
-        <w:rPr>
-          <w:lang w:val="en-GB"/>
-        </w:rPr>
-      </w:pPr>
-    </w:p>
-    <w:p>
-      <w:pPr>
-        <w:rPr>
-          <w:lang w:val="en-GB"/>
-        </w:rPr>
-      </w:pPr>
-    </w:p>
-    <w:p>
-      <w:pPr>
-        <w:rPr>
-          <w:lang w:val="en-GB"/>
-        </w:rPr>
-      </w:pPr>
-      <w:r>
-        <w:rPr>
-          <w:lang w:val="en-GB"/>
-        </w:rPr>
-        <w:t>6. Results</w:t>
-      </w:r>
-    </w:p>
-    <w:p>
-      <w:pPr>
-        <w:rPr>
-          <w:lang w:val="en-GB"/>
-        </w:rPr>
-      </w:pPr>
-      <w:r>
-        <w:rPr>
-          <w:lang w:val="en-GB"/>
-        </w:rPr>
-        <w:t xml:space="preserve">    6.1. Introduction</w:t>
-      </w:r>
-    </w:p>
-    <w:p>
-      <w:pPr>
-        <w:rPr>
-          <w:lang w:val="en-GB"/>
-        </w:rPr>
-      </w:pPr>
-      <w:r>
-        <w:rPr>
-          <w:lang w:val="en-GB"/>
-        </w:rPr>
-        <w:t xml:space="preserve">    6.2. Evaluation Criteria and Experimental Conditions [CHANGED]</w:t>
-      </w:r>
+      <w:r>
+        <w:rPr>
+          <w:lang w:val="en-GB"/>
+        </w:rPr>
+        <w:t>, X</w:t>
+      </w:r>
+    </w:p>
+    <w:p>
+      <w:pPr>
+        <w:rPr>
+          <w:lang w:val="en-GB"/>
+        </w:rPr>
+      </w:pPr>
+      <w:r>
+        <w:rPr>
+          <w:lang w:val="en-GB"/>
+        </w:rPr>
+        <w:t xml:space="preserve">        5.3.2. </w:t>
+      </w:r>
+      <w:proofErr w:type="gramStart"/>
+      <w:r>
+        <w:rPr>
+          <w:lang w:val="en-GB"/>
+        </w:rPr>
+        <w:t>Implementation</w:t>
+      </w:r>
+      <w:r>
+        <w:rPr>
+          <w:lang w:val="en-GB"/>
+        </w:rPr>
+        <w:t xml:space="preserve"> ,</w:t>
+      </w:r>
+      <w:proofErr w:type="gramEnd"/>
+      <w:r>
+        <w:rPr>
+          <w:lang w:val="en-GB"/>
+        </w:rPr>
+        <w:t xml:space="preserve"> X</w:t>
+      </w:r>
+    </w:p>
+    <w:p>
+      <w:pPr>
+        <w:rPr>
+          <w:lang w:val="en-GB"/>
+        </w:rPr>
+      </w:pPr>
+      <w:r>
+        <w:rPr>
+          <w:lang w:val="en-GB"/>
+        </w:rPr>
+        <w:t xml:space="preserve">        5.3.3. Technical </w:t>
+      </w:r>
+      <w:proofErr w:type="gramStart"/>
+      <w:r>
+        <w:rPr>
+          <w:lang w:val="en-GB"/>
+        </w:rPr>
+        <w:t>Validation</w:t>
+      </w:r>
+      <w:r>
+        <w:rPr>
+          <w:lang w:val="en-GB"/>
+        </w:rPr>
+        <w:t xml:space="preserve"> ,</w:t>
+      </w:r>
+      <w:proofErr w:type="gramEnd"/>
+      <w:r>
+        <w:rPr>
+          <w:lang w:val="en-GB"/>
+        </w:rPr>
+        <w:t xml:space="preserve"> X</w:t>
+      </w:r>
+    </w:p>
+    <w:p>
+      <w:pPr>
+        <w:rPr>
+          <w:lang w:val="en-GB"/>
+        </w:rPr>
+      </w:pPr>
+    </w:p>
+    <w:p>
+      <w:pPr>
+        <w:rPr>
+          <w:lang w:val="en-GB"/>
+        </w:rPr>
+      </w:pPr>
+    </w:p>
+    <w:p>
+      <w:pPr>
+        <w:rPr>
+          <w:lang w:val="en-GB"/>
+        </w:rPr>
+      </w:pPr>
+      <w:r>
+        <w:rPr>
+          <w:lang w:val="en-GB"/>
+        </w:rPr>
+        <w:t xml:space="preserve">6. </w:t>
+      </w:r>
+      <w:proofErr w:type="gramStart"/>
+      <w:r>
+        <w:rPr>
+          <w:lang w:val="en-GB"/>
+        </w:rPr>
+        <w:t>Results</w:t>
+      </w:r>
+      <w:r>
+        <w:rPr>
+          <w:lang w:val="en-GB"/>
+        </w:rPr>
+        <w:t xml:space="preserve"> ,X</w:t>
+      </w:r>
+      <w:proofErr w:type="gramEnd"/>
+    </w:p>
+    <w:p>
+      <w:pPr>
+        <w:rPr>
+          <w:lang w:val="en-GB"/>
+        </w:rPr>
+      </w:pPr>
+      <w:r>
+        <w:rPr>
+          <w:lang w:val="en-GB"/>
+        </w:rPr>
+        <w:t xml:space="preserve">    6.1. </w:t>
+      </w:r>
+      <w:proofErr w:type="gramStart"/>
+      <w:r>
+        <w:rPr>
+          <w:lang w:val="en-GB"/>
+        </w:rPr>
+        <w:t>Introduction</w:t>
+      </w:r>
+      <w:r>
+        <w:rPr>
+          <w:lang w:val="en-GB"/>
+        </w:rPr>
+        <w:t xml:space="preserve"> ,X</w:t>
+      </w:r>
+      <w:proofErr w:type="gramEnd"/>
+    </w:p>
+    <w:p>
+      <w:pPr>
+        <w:rPr>
+          <w:lang w:val="en-GB"/>
+        </w:rPr>
+      </w:pPr>
+      <w:r>
+        <w:rPr>
+          <w:lang w:val="en-GB"/>
+        </w:rPr>
+        <w:t xml:space="preserve">    6.2. Evaluation Criteria and Experimental Conditions [CHANGED</w:t>
+      </w:r>
+      <w:proofErr w:type="gramStart"/>
+      <w:r>
+        <w:rPr>
+          <w:lang w:val="en-GB"/>
+        </w:rPr>
+        <w:t>]</w:t>
+      </w:r>
+      <w:r>
+        <w:rPr>
+          <w:lang w:val="en-GB"/>
+        </w:rPr>
+        <w:t xml:space="preserve"> ,X</w:t>
+      </w:r>
+      <w:proofErr w:type="gramEnd"/>
     </w:p>
     <w:p>
       <w:pPr>
@@ -1281,6 +1660,12 @@
         </w:rPr>
         <w:t xml:space="preserve">    6.3. Rule-Based Approach Results [CHANGED]</w:t>
       </w:r>
+      <w:r>
+        <w:rPr>
+          <w:lang w:val="en-GB"/>
+        </w:rPr>
+        <w:t>, X</w:t>
+      </w:r>
     </w:p>
     <w:p>
       <w:pPr>
@@ -1294,6 +1679,156 @@
         </w:rPr>
         <w:t xml:space="preserve">    6.4. Statistical Approach Results [NEW]</w:t>
       </w:r>
+      <w:r>
+        <w:rPr>
+          <w:lang w:val="en-GB"/>
+        </w:rPr>
+        <w:t>, X</w:t>
+      </w:r>
+    </w:p>
+    <w:p>
+      <w:pPr>
+        <w:rPr>
+          <w:lang w:val="en-GB"/>
+        </w:rPr>
+      </w:pPr>
+      <w:r>
+        <w:rPr>
+          <w:lang w:val="en-GB"/>
+        </w:rPr>
+        <w:t xml:space="preserve">    6.5. Advanced / Machine-Learning Approach Results [NEW]</w:t>
+      </w:r>
+      <w:r>
+        <w:rPr>
+          <w:lang w:val="en-GB"/>
+        </w:rPr>
+        <w:t>, X</w:t>
+      </w:r>
+    </w:p>
+    <w:p>
+      <w:pPr>
+        <w:rPr>
+          <w:lang w:val="en-GB"/>
+        </w:rPr>
+      </w:pPr>
+      <w:r>
+        <w:rPr>
+          <w:lang w:val="en-GB"/>
+        </w:rPr>
+        <w:t xml:space="preserve">    6.6. Comparative Evaluation [NEW</w:t>
+      </w:r>
+      <w:proofErr w:type="gramStart"/>
+      <w:r>
+        <w:rPr>
+          <w:lang w:val="en-GB"/>
+        </w:rPr>
+        <w:t>]</w:t>
+      </w:r>
+      <w:r>
+        <w:rPr>
+          <w:lang w:val="en-GB"/>
+        </w:rPr>
+        <w:t>,X</w:t>
+      </w:r>
+      <w:proofErr w:type="gramEnd"/>
+    </w:p>
+    <w:p>
+      <w:pPr>
+        <w:rPr>
+          <w:lang w:val="en-GB"/>
+        </w:rPr>
+      </w:pPr>
+      <w:r>
+        <w:rPr>
+          <w:lang w:val="en-GB"/>
+        </w:rPr>
+        <w:t xml:space="preserve">    6.7. Practical / Stakeholder Evaluation [NEW]</w:t>
+      </w:r>
+      <w:r>
+        <w:rPr>
+          <w:lang w:val="en-GB"/>
+        </w:rPr>
+        <w:t>, X</w:t>
+      </w:r>
+    </w:p>
+    <w:p>
+      <w:pPr>
+        <w:rPr>
+          <w:lang w:val="en-GB"/>
+        </w:rPr>
+      </w:pPr>
+      <w:r>
+        <w:rPr>
+          <w:lang w:val="en-GB"/>
+        </w:rPr>
+        <w:t xml:space="preserve">    6.8. Summary</w:t>
+      </w:r>
+      <w:r>
+        <w:rPr>
+          <w:lang w:val="en-GB"/>
+        </w:rPr>
+        <w:t>, X</w:t>
+      </w:r>
+    </w:p>
+    <w:p>
+      <w:pPr>
+        <w:rPr>
+          <w:lang w:val="en-GB"/>
+        </w:rPr>
+      </w:pPr>
+    </w:p>
+    <w:p>
+      <w:pPr>
+        <w:rPr>
+          <w:lang w:val="en-GB"/>
+        </w:rPr>
+      </w:pPr>
+    </w:p>
+    <w:p>
+      <w:pPr>
+        <w:rPr>
+          <w:lang w:val="en-GB"/>
+        </w:rPr>
+      </w:pPr>
+      <w:r>
+        <w:rPr>
+          <w:lang w:val="en-GB"/>
+        </w:rPr>
+        <w:t>7. Discussion [CHANGED]</w:t>
+      </w:r>
+      <w:r>
+        <w:rPr>
+          <w:lang w:val="en-GB"/>
+        </w:rPr>
+        <w:t>, X</w:t>
+      </w:r>
+    </w:p>
+    <w:p>
+      <w:pPr>
+        <w:rPr>
+          <w:lang w:val="en-GB"/>
+        </w:rPr>
+      </w:pPr>
+      <w:r>
+        <w:rPr>
+          <w:lang w:val="en-GB"/>
+        </w:rPr>
+        <w:t xml:space="preserve">    7.1. Interpretation of Results [NEW</w:t>
+      </w:r>
+      <w:proofErr w:type="gramStart"/>
+      <w:r>
+        <w:rPr>
+          <w:lang w:val="en-GB"/>
+        </w:rPr>
+        <w:t>]</w:t>
+      </w:r>
+      <w:r>
+        <w:rPr>
+          <w:lang w:val="en-GB"/>
+        </w:rPr>
+        <w:t>,X</w:t>
+      </w:r>
+      <w:proofErr w:type="gramEnd"/>
     </w:p>
     <w:p>
       <w:pPr>
@@ -1306,100 +1841,14 @@
           <w:lang w:val="en-GB"/>
         </w:rPr>
         <w:lastRenderedPageBreak/>
-        <w:t xml:space="preserve">    6.5. Advanced / Machine-Learning Approach Results [NEW]</w:t>
-      </w:r>
-    </w:p>
-    <w:p>
-      <w:pPr>
-        <w:rPr>
-          <w:lang w:val="en-GB"/>
-        </w:rPr>
-      </w:pPr>
-      <w:r>
-        <w:rPr>
-          <w:lang w:val="en-GB"/>
-        </w:rPr>
-        <w:t xml:space="preserve">    6.6. Comparative Evaluation [NEW]</w:t>
-      </w:r>
-    </w:p>
-    <w:p>
-      <w:pPr>
-        <w:rPr>
-          <w:lang w:val="en-GB"/>
-        </w:rPr>
-      </w:pPr>
-      <w:r>
-        <w:rPr>
-          <w:lang w:val="en-GB"/>
-        </w:rPr>
-        <w:t xml:space="preserve">    6.7. Practical / Stakeholder Evaluation [NEW]</w:t>
-      </w:r>
-    </w:p>
-    <w:p>
-      <w:pPr>
-        <w:rPr>
-          <w:lang w:val="en-GB"/>
-        </w:rPr>
-      </w:pPr>
-      <w:r>
-        <w:rPr>
-          <w:lang w:val="en-GB"/>
-        </w:rPr>
-        <w:t xml:space="preserve">    6.8. Summary</w:t>
-      </w:r>
-    </w:p>
-    <w:p>
-      <w:pPr>
-        <w:rPr>
-          <w:lang w:val="en-GB"/>
-        </w:rPr>
-      </w:pPr>
-    </w:p>
-    <w:p>
-      <w:pPr>
-        <w:rPr>
-          <w:lang w:val="en-GB"/>
-        </w:rPr>
-      </w:pPr>
-    </w:p>
-    <w:p>
-      <w:pPr>
-        <w:rPr>
-          <w:lang w:val="en-GB"/>
-        </w:rPr>
-      </w:pPr>
-      <w:r>
-        <w:rPr>
-          <w:lang w:val="en-GB"/>
-        </w:rPr>
-        <w:t>7. Discussion [CHANGED]</w:t>
-      </w:r>
-    </w:p>
-    <w:p>
-      <w:pPr>
-        <w:rPr>
-          <w:lang w:val="en-GB"/>
-        </w:rPr>
-      </w:pPr>
-      <w:r>
-        <w:rPr>
-          <w:lang w:val="en-GB"/>
-        </w:rPr>
-        <w:t xml:space="preserve">    7.1. Interpretation of Results [NEW]</w:t>
-      </w:r>
-    </w:p>
-    <w:p>
-      <w:pPr>
-        <w:rPr>
-          <w:lang w:val="en-GB"/>
-        </w:rPr>
-      </w:pPr>
-      <w:r>
-        <w:rPr>
-          <w:lang w:val="en-GB"/>
-        </w:rPr>
         <w:t xml:space="preserve">    7.2. Evaluation of Research Hypotheses [NEW]</w:t>
       </w:r>
+      <w:r>
+        <w:rPr>
+          <w:lang w:val="en-GB"/>
+        </w:rPr>
+        <w:t>, X</w:t>
+      </w:r>
     </w:p>
     <w:p>
       <w:pPr>
@@ -1413,6 +1862,12 @@
         </w:rPr>
         <w:t xml:space="preserve">    7.3. Answer to the Research Question [NEW]</w:t>
       </w:r>
+      <w:r>
+        <w:rPr>
+          <w:lang w:val="en-GB"/>
+        </w:rPr>
+        <w:t>, X</w:t>
+      </w:r>
     </w:p>
     <w:p>
       <w:pPr>
@@ -1426,6 +1881,12 @@
         </w:rPr>
         <w:t xml:space="preserve">    7.4. Comparison with Existing Research [NEW]</w:t>
       </w:r>
+      <w:r>
+        <w:rPr>
+          <w:lang w:val="en-GB"/>
+        </w:rPr>
+        <w:t>, X</w:t>
+      </w:r>
     </w:p>
     <w:p>
       <w:pPr>
@@ -1439,6 +1900,12 @@
         </w:rPr>
         <w:t xml:space="preserve">    7.5. Practical Implications [NEW]</w:t>
       </w:r>
+      <w:r>
+        <w:rPr>
+          <w:lang w:val="en-GB"/>
+        </w:rPr>
+        <w:t>, X</w:t>
+      </w:r>
     </w:p>
     <w:p>
       <w:pPr>
@@ -1452,6 +1919,12 @@
         </w:rPr>
         <w:t xml:space="preserve">    7.6. Generalisability of the Results [NEW]</w:t>
       </w:r>
+      <w:r>
+        <w:rPr>
+          <w:lang w:val="en-GB"/>
+        </w:rPr>
+        <w:t>, X</w:t>
+      </w:r>
     </w:p>
     <w:p>
       <w:pPr>
@@ -1465,6 +1938,12 @@
         </w:rPr>
         <w:t xml:space="preserve">    7.7. Threats to Validity and Limitations [NEW]</w:t>
       </w:r>
+      <w:r>
+        <w:rPr>
+          <w:lang w:val="en-GB"/>
+        </w:rPr>
+        <w:t>, X</w:t>
+      </w:r>
     </w:p>
     <w:p>
       <w:pPr>
@@ -1492,6 +1971,12 @@
         </w:rPr>
         <w:t>8. Conclusion and Outlook [CHANGED]</w:t>
       </w:r>
+      <w:r>
+        <w:rPr>
+          <w:lang w:val="en-GB"/>
+        </w:rPr>
+        <w:t>, X</w:t>
+      </w:r>
     </w:p>
     <w:p>
       <w:pPr>
@@ -1505,44 +1990,110 @@
         </w:rPr>
         <w:t xml:space="preserve">    8.1. Summary of Findings</w:t>
       </w:r>
-    </w:p>
-    <w:p>
-      <w:pPr>
-        <w:rPr>
-          <w:lang w:val="en-GB"/>
-        </w:rPr>
-      </w:pPr>
-      <w:r>
-        <w:rPr>
-          <w:lang w:val="en-GB"/>
-        </w:rPr>
-        <w:t xml:space="preserve">    8.2. Scientific Contribution</w:t>
-      </w:r>
-    </w:p>
-    <w:p>
-      <w:pPr>
-        <w:rPr>
-          <w:lang w:val="en-GB"/>
-        </w:rPr>
-      </w:pPr>
-      <w:r>
-        <w:rPr>
-          <w:lang w:val="en-GB"/>
-        </w:rPr>
-        <w:t xml:space="preserve">    8.3. Practical Contribution</w:t>
-      </w:r>
-    </w:p>
-    <w:p>
-      <w:pPr>
-        <w:rPr>
-          <w:lang w:val="en-GB"/>
-        </w:rPr>
-      </w:pPr>
-      <w:r>
-        <w:rPr>
-          <w:lang w:val="en-GB"/>
-        </w:rPr>
-        <w:t xml:space="preserve">    8.4. Future Work</w:t>
+      <w:r>
+        <w:rPr>
+          <w:lang w:val="en-GB"/>
+        </w:rPr>
+        <w:t>, X</w:t>
+      </w:r>
+    </w:p>
+    <w:p>
+      <w:pPr>
+        <w:rPr>
+          <w:lang w:val="en-GB"/>
+        </w:rPr>
+      </w:pPr>
+      <w:r>
+        <w:rPr>
+          <w:lang w:val="en-GB"/>
+        </w:rPr>
+        <w:t xml:space="preserve">    8.2. Scientific </w:t>
+      </w:r>
+      <w:proofErr w:type="gramStart"/>
+      <w:r>
+        <w:rPr>
+          <w:lang w:val="en-GB"/>
+        </w:rPr>
+        <w:t>Contribution</w:t>
+      </w:r>
+      <w:r>
+        <w:rPr>
+          <w:lang w:val="en-GB"/>
+        </w:rPr>
+        <w:t xml:space="preserve"> ,</w:t>
+      </w:r>
+      <w:proofErr w:type="gramEnd"/>
+      <w:r>
+        <w:rPr>
+          <w:lang w:val="en-GB"/>
+        </w:rPr>
+        <w:t xml:space="preserve"> X</w:t>
+      </w:r>
+    </w:p>
+    <w:p>
+      <w:pPr>
+        <w:rPr>
+          <w:lang w:val="en-GB"/>
+        </w:rPr>
+      </w:pPr>
+      <w:r>
+        <w:rPr>
+          <w:lang w:val="en-GB"/>
+        </w:rPr>
+        <w:t xml:space="preserve">    8.3. Practical </w:t>
+      </w:r>
+      <w:proofErr w:type="gramStart"/>
+      <w:r>
+        <w:rPr>
+          <w:lang w:val="en-GB"/>
+        </w:rPr>
+        <w:t>Contribution</w:t>
+      </w:r>
+      <w:r>
+        <w:rPr>
+          <w:lang w:val="en-GB"/>
+        </w:rPr>
+        <w:t xml:space="preserve"> ,</w:t>
+      </w:r>
+      <w:proofErr w:type="gramEnd"/>
+      <w:r>
+        <w:rPr>
+          <w:lang w:val="en-GB"/>
+        </w:rPr>
+        <w:t xml:space="preserve"> X</w:t>
+      </w:r>
+    </w:p>
+    <w:p>
+      <w:pPr>
+        <w:rPr>
+          <w:lang w:val="en-GB"/>
+        </w:rPr>
+      </w:pPr>
+      <w:r>
+        <w:rPr>
+          <w:lang w:val="en-GB"/>
+        </w:rPr>
+        <w:t xml:space="preserve">    8.4. Future </w:t>
+      </w:r>
+      <w:proofErr w:type="gramStart"/>
+      <w:r>
+        <w:rPr>
+          <w:lang w:val="en-GB"/>
+        </w:rPr>
+        <w:t>Work</w:t>
+      </w:r>
+      <w:r>
+        <w:rPr>
+          <w:lang w:val="en-GB"/>
+        </w:rPr>
+        <w:t xml:space="preserve"> ,</w:t>
+      </w:r>
+      <w:proofErr w:type="gramEnd"/>
+      <w:r>
+        <w:rPr>
+          <w:lang w:val="en-GB"/>
+        </w:rPr>
+        <w:t xml:space="preserve"> X</w:t>
       </w:r>
     </w:p>
     <w:p>
@@ -1661,7 +2212,6 @@
         <w:rPr>
           <w:lang w:val="en-GB"/>
         </w:rPr>
-        <w:lastRenderedPageBreak/>
         <w:t xml:space="preserve">    A. Queries and Technical Artefacts</w:t>
       </w:r>
     </w:p>
@@ -1801,7 +2351,14 @@
       <w:rPr>
         <w:lang w:val="en-GB"/>
       </w:rPr>
-      <w:t>Master Thesis Outline MSc Master i</w:t>
+      <w:t xml:space="preserve">Master Thesis Outline MSc </w:t>
+    </w:r>
+    <w:proofErr w:type="gramStart"/>
+    <w:r>
+      <w:rPr>
+        <w:lang w:val="en-GB"/>
+      </w:rPr>
+      <w:t>Master i</w:t>
     </w:r>
     <w:r>
       <w:rPr>
@@ -1809,6 +2366,7 @@
       </w:rPr>
       <w:t>n Engineering Data Science</w:t>
     </w:r>
+    <w:proofErr w:type="gramEnd"/>
     <w:r>
       <w:rPr>
         <w:lang w:val="en-GB"/>

</xml_diff>